<commit_message>
Left align second-level Typora headings
</commit_message>
<xml_diff>
--- a/typora/typora公文写作_word导出_reference.docx
+++ b/typora/typora公文写作_word导出_reference.docx
@@ -647,8 +647,8 @@
     <w:pPr>
       <w:keepNext/>
       <w:keepLines/>
-      <w:spacing w:before="0" w:after="200" w:line="600" w:lineRule="exact"/>
-      <w:jc w:val="center"/>
+      <w:spacing w:before="240" w:after="0" w:line="600" w:lineRule="exact"/>
+      <w:jc w:val="left"/>
       <w:outlineLvl w:val="1"/>
     </w:pPr>
     <w:rPr>
@@ -671,6 +671,7 @@
     <w:qFormat/>
     <w:rsid w:val="00FC693F"/>
     <w:pPr>
+      <w:jc w:val="left"/>
       <w:keepNext/>
       <w:keepLines/>
       <w:spacing w:before="240" w:after="0" w:line="560" w:lineRule="exact"/>
@@ -696,6 +697,7 @@
     <w:qFormat/>
     <w:rsid w:val="00FC693F"/>
     <w:pPr>
+      <w:jc w:val="left"/>
       <w:keepNext/>
       <w:keepLines/>
       <w:spacing w:before="0" w:after="0" w:line="560" w:lineRule="exact"/>
@@ -722,6 +724,7 @@
     <w:qFormat/>
     <w:rsid w:val="00FC693F"/>
     <w:pPr>
+      <w:jc w:val="left"/>
       <w:keepNext/>
       <w:keepLines/>
       <w:spacing w:before="200" w:after="0"/>
@@ -743,6 +746,7 @@
     <w:qFormat/>
     <w:rsid w:val="00FC693F"/>
     <w:pPr>
+      <w:jc w:val="left"/>
       <w:keepNext/>
       <w:keepLines/>
       <w:spacing w:before="200" w:after="0"/>
@@ -766,6 +770,7 @@
     <w:qFormat/>
     <w:rsid w:val="00FC693F"/>
     <w:pPr>
+      <w:jc w:val="left"/>
       <w:keepNext/>
       <w:keepLines/>
       <w:spacing w:before="200" w:after="0"/>
@@ -789,6 +794,7 @@
     <w:qFormat/>
     <w:rsid w:val="00FC693F"/>
     <w:pPr>
+      <w:jc w:val="left"/>
       <w:keepNext/>
       <w:keepLines/>
       <w:spacing w:before="200" w:after="0"/>
@@ -812,6 +818,7 @@
     <w:qFormat/>
     <w:rsid w:val="00FC693F"/>
     <w:pPr>
+      <w:jc w:val="left"/>
       <w:keepNext/>
       <w:keepLines/>
       <w:spacing w:before="200" w:after="0"/>
@@ -959,7 +966,7 @@
         <w:ilvl w:val="1"/>
       </w:numPr>
       <w:spacing w:before="0" w:after="240" w:line="560" w:lineRule="exact"/>
-      <w:jc w:val="center"/>
+      <w:jc w:val="left"/>
     </w:pPr>
     <w:rPr>
       <w:rFonts w:ascii="黑体" w:hAnsi="黑体" w:eastAsia="黑体" w:cs="黑体" w:hint="eastAsia"/>

</xml_diff>